<commit_message>
feat: pontuacao uniforme por questao, sincronizacao em tempo real, filtros por disciplina e portal do estudante
</commit_message>
<xml_diff>
--- a/docs/Análise, Desenho e Implementação.docx
+++ b/docs/Análise, Desenho e Implementação.docx
@@ -10,136 +10,370 @@
         <w:t>ANALISE DESENHO E IMPLEMENTAÇÃO</w:t>
       </w:r>
     </w:p>
-    <w:p/>
     <w:p>
-      <w:r>
-        <w:t>Processo de Criação:</w:t>
+      <w:pPr>
+        <w:jc w:val="center"/>
+      </w:pPr>
+      <w:r>
+        <w:t>MYCLASSPLUSS “MyClassPluss”</w:t>
+      </w:r>
+      <w:r>
+        <w:br/>
       </w:r>
     </w:p>
     <w:p>
-      <w:r>
-        <w:t>1</w:t>
-      </w:r>
-      <w:r>
-        <w:t>. Abrir o App com a tela para Cadastro de Professores/Instrutores com a opção de esqueci minha senha (quando isto acontecer, deverá ser enviado um e-mail para o e-mail cadastrado com a senha).</w:t>
-      </w:r>
-      <w:r>
-        <w:br/>
-      </w:r>
-      <w:r>
-        <w:t>2</w:t>
-      </w:r>
-      <w:r>
-        <w:t>.- Gestor Acadêmico</w:t>
+      <w:pPr>
+        <w:jc w:val="both"/>
+      </w:pPr>
+      <w:r>
+        <w:t>Este aplicativo será um Web App, onde professores/instrutores irão adquiri-lo (Comprar) para ter total controle de gestão acadêmica pessoal podendo realizar:</w:t>
       </w:r>
     </w:p>
     <w:p>
       <w:r>
-        <w:t>2</w:t>
-      </w:r>
-      <w:r>
-        <w:t>.1. Inserir, editar ou excluir as instituições onde o Professor irá ministrar suas aulas.</w:t>
-      </w:r>
-      <w:r>
-        <w:br/>
-      </w:r>
-      <w:r>
-        <w:t>2</w:t>
-      </w:r>
-      <w:r>
-        <w:t>.2. Inserir, editar ou excluir os Cursos que serão ministrados nas instituições.</w:t>
-      </w:r>
-      <w:r>
-        <w:br/>
-      </w:r>
-      <w:r>
-        <w:t>2</w:t>
-      </w:r>
-      <w:r>
-        <w:t>.3. Inserir, editar ou excluir Disciplinas que farão parte deste</w:t>
-      </w:r>
-      <w:r>
-        <w:t>s</w:t>
-      </w:r>
-      <w:r>
-        <w:t xml:space="preserve"> curso</w:t>
-      </w:r>
-      <w:r>
-        <w:t>s</w:t>
-      </w:r>
-      <w:r>
-        <w:t>.</w:t>
-      </w:r>
-      <w:r>
-        <w:br/>
-      </w:r>
-      <w:r>
-        <w:t>2</w:t>
-      </w:r>
-      <w:r>
-        <w:t>.4. Inserir, editar ou excluir Salas/Ambientes onde estas disciplinas serão ministradas</w:t>
-      </w:r>
-      <w:r>
-        <w:t>.</w:t>
-      </w:r>
-      <w:r>
-        <w:br/>
-      </w:r>
-      <w:r>
-        <w:t>2</w:t>
-      </w:r>
-      <w:r>
-        <w:t>.5. Inserir, editar ou excluir Turmas para os cursos e disciplinas a serem ministrados em uma sala.</w:t>
-      </w:r>
-      <w:r>
-        <w:br/>
-      </w:r>
-      <w:r>
-        <w:t>2</w:t>
-      </w:r>
-      <w:r>
-        <w:t>.6. Inserir, editar e excluir alunos nas turmas dos cursos aprendendo uma determinada disciplina em um horário (hora incial/hora final) e durante um período especifico (Data inicial e data de término).</w:t>
-      </w:r>
-      <w:r>
-        <w:br/>
-      </w:r>
-      <w:r>
-        <w:t>2</w:t>
-      </w:r>
-      <w:r>
-        <w:t>.7</w:t>
-      </w:r>
-      <w:r>
-        <w:t>.</w:t>
-      </w:r>
-      <w:r>
-        <w:t xml:space="preserve"> Inserir, editar e excluir aulas onde o professor irá gerir suas listas de chamada, inserção de notas.</w:t>
+        <w:br/>
+        <w:t>1.- Gestão Acadêmica</w:t>
       </w:r>
     </w:p>
     <w:p>
       <w:r>
-        <w:t>2.8. Relatórios de Notas(Obtidos no OffClass 1.0), Chamadas dentre outros.</w:t>
+        <w:t>1.</w:t>
+      </w:r>
+      <w:r>
+        <w:t xml:space="preserve">1.- </w:t>
+      </w:r>
+      <w:r>
+        <w:t>Inserir, Editar</w:t>
+      </w:r>
+      <w:r>
+        <w:t xml:space="preserve">, </w:t>
+      </w:r>
+      <w:r>
+        <w:t>Excluir</w:t>
+      </w:r>
+      <w:r>
+        <w:t xml:space="preserve"> ou Consultar</w:t>
+      </w:r>
+      <w:r>
+        <w:t xml:space="preserve"> </w:t>
+      </w:r>
+      <w:r>
+        <w:t>Instituições.</w:t>
+      </w:r>
+      <w:r>
+        <w:br/>
+      </w:r>
+      <w:r>
+        <w:t>1.</w:t>
+      </w:r>
+      <w:r>
+        <w:t xml:space="preserve">2.- </w:t>
+      </w:r>
+      <w:r>
+        <w:t>Inserir, Editar, Excluir ou Consultar</w:t>
+      </w:r>
+      <w:r>
+        <w:t xml:space="preserve"> Cursos.</w:t>
       </w:r>
     </w:p>
     <w:p>
       <w:r>
-        <w:t>3</w:t>
-      </w:r>
-      <w:r>
-        <w:t>. Ambiente de A</w:t>
-      </w:r>
-      <w:r>
-        <w:t>ulas Interativas</w:t>
-      </w:r>
-      <w:r>
-        <w:br/>
-        <w:t>3.1. Acesso ao nosso OffClass 1.0 mas todos os resultados obtidos aqui (notas em atividades, avaliações, quizzes) irão para o gestor academico.</w:t>
-      </w:r>
-      <w:r>
-        <w:br/>
+        <w:t>1.</w:t>
+      </w:r>
+      <w:r>
+        <w:t xml:space="preserve">3.- </w:t>
+      </w:r>
+      <w:r>
+        <w:t>Inserir, Editar, Excluir ou Consultar</w:t>
+      </w:r>
+      <w:r>
+        <w:t xml:space="preserve"> Disciplinas.</w:t>
       </w:r>
     </w:p>
-    <w:p/>
+    <w:p>
+      <w:r>
+        <w:t>1.</w:t>
+      </w:r>
+      <w:r>
+        <w:t xml:space="preserve">4.- </w:t>
+      </w:r>
+      <w:r>
+        <w:t>Inserir, Editar, Excluir ou Consultar</w:t>
+      </w:r>
+      <w:r>
+        <w:t xml:space="preserve"> </w:t>
+      </w:r>
+      <w:r>
+        <w:t>S</w:t>
+      </w:r>
+      <w:r>
+        <w:t>alas/</w:t>
+      </w:r>
+      <w:r>
+        <w:t>A</w:t>
+      </w:r>
+      <w:r>
+        <w:t>mbientes.</w:t>
+      </w:r>
+    </w:p>
+    <w:p>
+      <w:r>
+        <w:t>1.</w:t>
+      </w:r>
+      <w:r>
+        <w:t xml:space="preserve">5.- </w:t>
+      </w:r>
+      <w:r>
+        <w:t>Inserir, Editar, Excluir ou Consultar</w:t>
+      </w:r>
+      <w:r>
+        <w:t xml:space="preserve"> Turmas</w:t>
+      </w:r>
+      <w:r>
+        <w:br/>
+      </w:r>
+      <w:r>
+        <w:t>1.</w:t>
+      </w:r>
+      <w:r>
+        <w:t xml:space="preserve">6.- </w:t>
+      </w:r>
+      <w:r>
+        <w:t>Inserir, Editar, Excluir ou Consultar</w:t>
+      </w:r>
+      <w:r>
+        <w:t xml:space="preserve"> Alunos. </w:t>
+      </w:r>
+    </w:p>
+    <w:p>
+      <w:r>
+        <w:t>1.7.- Inserir, Editar, Excluir ou Consultas Listas de Chamadas</w:t>
+      </w:r>
+      <w:r>
+        <w:br/>
+      </w:r>
+      <w:r>
+        <w:br/>
+        <w:t xml:space="preserve">2.- Gerir </w:t>
+      </w:r>
+      <w:r>
+        <w:t xml:space="preserve">Conteúdos, </w:t>
+      </w:r>
+      <w:r>
+        <w:t>Atividades, Avaliações e Quizzes Interativos</w:t>
+      </w:r>
+    </w:p>
+    <w:p>
+      <w:r>
+        <w:br/>
+        <w:t>2.1.- Inserir, Excluir e Consultar conteúdos</w:t>
+      </w:r>
+      <w:r>
+        <w:t xml:space="preserve"> criados pelo professor</w:t>
+      </w:r>
+      <w:r>
+        <w:t>.</w:t>
+      </w:r>
+    </w:p>
+    <w:p>
+      <w:r>
+        <w:t>2.2.- Inserir, Edita, Excluir ou Consultar Atividades Avaliativas.</w:t>
+      </w:r>
+    </w:p>
+    <w:p>
+      <w:r>
+        <w:t xml:space="preserve">2.3.- </w:t>
+      </w:r>
+      <w:r>
+        <w:t xml:space="preserve">Inserir, Edita, Excluir ou Consultar Atividades </w:t>
+      </w:r>
+      <w:r>
+        <w:t>Práticas.</w:t>
+      </w:r>
+      <w:r>
+        <w:br/>
+        <w:t>2.4.- Inserir, Editar, Excluir ou Consultar Avaliações Formais.</w:t>
+      </w:r>
+      <w:r>
+        <w:br/>
+        <w:t>2.5.- Inserir, Editar, Excluir ou Consultar Quizzes Interativos.</w:t>
+      </w:r>
+      <w:r>
+        <w:br/>
+      </w:r>
+    </w:p>
+    <w:p>
+      <w:r>
+        <w:t xml:space="preserve">3.- </w:t>
+      </w:r>
+      <w:r>
+        <w:t>Lançar na Tela dos Smartphones dos Alunos</w:t>
+      </w:r>
+      <w:r>
+        <w:br/>
+      </w:r>
+    </w:p>
+    <w:p>
+      <w:r>
+        <w:t>3.1.- Conteúdos</w:t>
+      </w:r>
+      <w:r>
+        <w:br/>
+        <w:t>3.2.- Atividades Avaliativas</w:t>
+      </w:r>
+      <w:r>
+        <w:br/>
+        <w:t>3.3.- Atividades Práticas</w:t>
+      </w:r>
+      <w:r>
+        <w:br/>
+        <w:t>3.4.- Avaliações Formais</w:t>
+      </w:r>
+      <w:r>
+        <w:br/>
+        <w:t>3.5. Quizzes Interativos</w:t>
+      </w:r>
+    </w:p>
+    <w:p>
+      <w:r>
+        <w:t>4.- Relatórios</w:t>
+      </w:r>
+      <w:r>
+        <w:br/>
+      </w:r>
+    </w:p>
+    <w:p>
+      <w:r>
+        <w:t>4.1.- Relatório de Instituições</w:t>
+      </w:r>
+      <w:r>
+        <w:br/>
+        <w:t xml:space="preserve">4.2.- </w:t>
+      </w:r>
+      <w:r>
+        <w:t xml:space="preserve">Relatório de </w:t>
+      </w:r>
+      <w:r>
+        <w:t>Cursos</w:t>
+      </w:r>
+      <w:r>
+        <w:br/>
+      </w:r>
+      <w:r>
+        <w:lastRenderedPageBreak/>
+        <w:t xml:space="preserve">4.3.- </w:t>
+      </w:r>
+      <w:r>
+        <w:t xml:space="preserve">Relatório de </w:t>
+      </w:r>
+      <w:r>
+        <w:t>Disciplinas</w:t>
+      </w:r>
+      <w:r>
+        <w:br/>
+        <w:t xml:space="preserve">4.4. </w:t>
+      </w:r>
+      <w:r>
+        <w:t xml:space="preserve">Relatório de </w:t>
+      </w:r>
+      <w:r>
+        <w:t>Turmas</w:t>
+      </w:r>
+      <w:r>
+        <w:br/>
+        <w:t xml:space="preserve">4.5.- </w:t>
+      </w:r>
+      <w:r>
+        <w:t xml:space="preserve">Relatório de </w:t>
+      </w:r>
+      <w:r>
+        <w:t>Salas</w:t>
+      </w:r>
+      <w:r>
+        <w:br/>
+        <w:t xml:space="preserve">4.6.- </w:t>
+      </w:r>
+      <w:r>
+        <w:t xml:space="preserve">Relatório de </w:t>
+      </w:r>
+      <w:r>
+        <w:t>Alunos</w:t>
+      </w:r>
+      <w:r>
+        <w:br/>
+        <w:t>4.7.- Relatórios de Notas por Aluno</w:t>
+      </w:r>
+      <w:r>
+        <w:br/>
+        <w:t>4.8.- Relatórios de Notas por Turma</w:t>
+      </w:r>
+      <w:r>
+        <w:br/>
+        <w:t>4.9.- Relatórios de Faltas por Aluno</w:t>
+      </w:r>
+      <w:r>
+        <w:br/>
+        <w:t>4.10.- Relatório de Faltas pr Turma</w:t>
+      </w:r>
+    </w:p>
+    <w:p>
+      <w:r>
+        <w:t>5.- Históricos</w:t>
+      </w:r>
+      <w:r>
+        <w:br/>
+        <w:t>5.1.- Histórico de Alunos</w:t>
+      </w:r>
+      <w:r>
+        <w:br/>
+        <w:t xml:space="preserve">5.1.- Histórico de </w:t>
+      </w:r>
+      <w:r>
+        <w:t>Aproveitamento (Faltas e Notas)</w:t>
+      </w:r>
+      <w:r>
+        <w:t xml:space="preserve"> dos Alunos</w:t>
+      </w:r>
+      <w:r>
+        <w:br/>
+      </w:r>
+      <w:r>
+        <w:br/>
+      </w:r>
+      <w:r>
+        <w:br/>
+      </w:r>
+      <w:r>
+        <w:t>Detalhes:</w:t>
+      </w:r>
+    </w:p>
+    <w:p>
+      <w:r>
+        <w:t xml:space="preserve">1.- </w:t>
+      </w:r>
+      <w:r>
+        <w:t>Dentro de toda essa gestão teremos que estabele</w:t>
+      </w:r>
+      <w:r>
+        <w:t>cer</w:t>
+      </w:r>
+      <w:r>
+        <w:t xml:space="preserve"> relações entre as tabelas e campos a serem criados para que tenhamos uma harmonia total e uma fluidez dos dados para que o app funcione sem erros e travamentos.</w:t>
+      </w:r>
+      <w:r>
+        <w:br/>
+        <w:t xml:space="preserve">2.- É de suma importância estabelecer o acesso dos alunos ao conteúdo, as atividades, as avaliações e quizzes de maneira instantânea </w:t>
+      </w:r>
+      <w:r>
+        <w:t>fazendo com</w:t>
+      </w:r>
+      <w:r>
+        <w:t xml:space="preserve"> que os dados visualizados e enviados (respostas) por eles flua pela rede sem solavancos e travamentos, mantendo acesso imediato tanto pelo professor quanto pelo prórprio aluno.</w:t>
+      </w:r>
+      <w:r>
+        <w:br/>
+      </w:r>
+    </w:p>
     <w:sectPr>
       <w:pgSz w:w="11906" w:h="16838"/>
       <w:pgMar w:top="1417" w:right="1701" w:bottom="1417" w:left="1701" w:header="708" w:footer="708" w:gutter="0"/>
@@ -265,8 +499,100 @@
       </w:pPr>
     </w:lvl>
   </w:abstractNum>
+  <w:abstractNum w:abstractNumId="1" w15:restartNumberingAfterBreak="0">
+    <w:nsid w:val="3B6B4653"/>
+    <w:multiLevelType w:val="hybridMultilevel"/>
+    <w:tmpl w:val="F790F178"/>
+    <w:lvl w:ilvl="0" w:tplc="0416000F">
+      <w:start w:val="1"/>
+      <w:numFmt w:val="decimal"/>
+      <w:lvlText w:val="%1."/>
+      <w:lvlJc w:val="left"/>
+      <w:pPr>
+        <w:ind w:left="720" w:hanging="360"/>
+      </w:pPr>
+      <w:rPr>
+        <w:rFonts w:hint="default"/>
+      </w:rPr>
+    </w:lvl>
+    <w:lvl w:ilvl="1" w:tplc="04160019" w:tentative="1">
+      <w:start w:val="1"/>
+      <w:numFmt w:val="lowerLetter"/>
+      <w:lvlText w:val="%2."/>
+      <w:lvlJc w:val="left"/>
+      <w:pPr>
+        <w:ind w:left="1440" w:hanging="360"/>
+      </w:pPr>
+    </w:lvl>
+    <w:lvl w:ilvl="2" w:tplc="0416001B" w:tentative="1">
+      <w:start w:val="1"/>
+      <w:numFmt w:val="lowerRoman"/>
+      <w:lvlText w:val="%3."/>
+      <w:lvlJc w:val="right"/>
+      <w:pPr>
+        <w:ind w:left="2160" w:hanging="180"/>
+      </w:pPr>
+    </w:lvl>
+    <w:lvl w:ilvl="3" w:tplc="0416000F" w:tentative="1">
+      <w:start w:val="1"/>
+      <w:numFmt w:val="decimal"/>
+      <w:lvlText w:val="%4."/>
+      <w:lvlJc w:val="left"/>
+      <w:pPr>
+        <w:ind w:left="2880" w:hanging="360"/>
+      </w:pPr>
+    </w:lvl>
+    <w:lvl w:ilvl="4" w:tplc="04160019" w:tentative="1">
+      <w:start w:val="1"/>
+      <w:numFmt w:val="lowerLetter"/>
+      <w:lvlText w:val="%5."/>
+      <w:lvlJc w:val="left"/>
+      <w:pPr>
+        <w:ind w:left="3600" w:hanging="360"/>
+      </w:pPr>
+    </w:lvl>
+    <w:lvl w:ilvl="5" w:tplc="0416001B" w:tentative="1">
+      <w:start w:val="1"/>
+      <w:numFmt w:val="lowerRoman"/>
+      <w:lvlText w:val="%6."/>
+      <w:lvlJc w:val="right"/>
+      <w:pPr>
+        <w:ind w:left="4320" w:hanging="180"/>
+      </w:pPr>
+    </w:lvl>
+    <w:lvl w:ilvl="6" w:tplc="0416000F" w:tentative="1">
+      <w:start w:val="1"/>
+      <w:numFmt w:val="decimal"/>
+      <w:lvlText w:val="%7."/>
+      <w:lvlJc w:val="left"/>
+      <w:pPr>
+        <w:ind w:left="5040" w:hanging="360"/>
+      </w:pPr>
+    </w:lvl>
+    <w:lvl w:ilvl="7" w:tplc="04160019" w:tentative="1">
+      <w:start w:val="1"/>
+      <w:numFmt w:val="lowerLetter"/>
+      <w:lvlText w:val="%8."/>
+      <w:lvlJc w:val="left"/>
+      <w:pPr>
+        <w:ind w:left="5760" w:hanging="360"/>
+      </w:pPr>
+    </w:lvl>
+    <w:lvl w:ilvl="8" w:tplc="0416001B" w:tentative="1">
+      <w:start w:val="1"/>
+      <w:numFmt w:val="lowerRoman"/>
+      <w:lvlText w:val="%9."/>
+      <w:lvlJc w:val="right"/>
+      <w:pPr>
+        <w:ind w:left="6480" w:hanging="180"/>
+      </w:pPr>
+    </w:lvl>
+  </w:abstractNum>
   <w:num w:numId="1" w16cid:durableId="63991664">
     <w:abstractNumId w:val="0"/>
+  </w:num>
+  <w:num w:numId="2" w16cid:durableId="779957938">
+    <w:abstractNumId w:val="1"/>
   </w:num>
 </w:numbering>
 </file>

</xml_diff>